<commit_message>
docs: nightly study guide update 2026-07-13
</commit_message>
<xml_diff>
--- a/study_guides/Circles_Geometry_Study_Guide.docx
+++ b/study_guides/Circles_Geometry_Study_Guide.docx
@@ -2,7 +2,17 @@
 <file path=word/document.xml><?xml version="1.0" encoding="utf-8"?>
 <w:document xmlns:w="http://schemas.openxmlformats.org/wordprocessingml/2006/main" xmlns:m="http://schemas.openxmlformats.org/officeDocument/2006/math" xmlns:r="http://schemas.openxmlformats.org/officeDocument/2006/relationships" xmlns:o="urn:schemas-microsoft-com:office:office" xmlns:v="urn:schemas-microsoft-com:vml" xmlns:w10="urn:schemas-microsoft-com:office:word" xmlns:a="http://schemas.openxmlformats.org/drawingml/2006/main" xmlns:pic="http://schemas.openxmlformats.org/drawingml/2006/picture" xmlns:wp="http://schemas.openxmlformats.org/drawingml/2006/wordprocessingDrawing">
   <w:body>
-    <w:bookmarkStart w:id="56" w:name="circles-geometry-study-guide"/>
+    <w:bookmarkStart w:id="20" w:name="circles-geometry-study-guide"/>
+    <w:p>
+      <w:pPr>
+        <w:pStyle w:val="Heading1"/>
+      </w:pPr>
+      <w:r>
+        <w:t xml:space="preserve">Circles Geometry Study Guide</w:t>
+      </w:r>
+    </w:p>
+    <w:bookmarkEnd w:id="20"/>
+    <w:bookmarkStart w:id="61" w:name="circles-geometry-study-guide-1"/>
     <w:p>
       <w:pPr>
         <w:pStyle w:val="Heading1"/>
@@ -23,14 +33,7 @@
         <w:t xml:space="preserve">Extracted from 2026 Summer SAT/ACT @ AHA classroom materials (19_Circles.pdf, SAT Geometry Problems.pdf)</w:t>
       </w:r>
     </w:p>
-    <w:p>
-      <w:r>
-        <w:pict>
-          <v:rect style="width:0;height:1.5pt" o:hralign="center" o:hrstd="t" o:hr="t"/>
-        </w:pict>
-      </w:r>
-    </w:p>
-    <w:bookmarkStart w:id="20" w:name="overview"/>
+    <w:bookmarkStart w:id="21" w:name="overview"/>
     <w:p>
       <w:pPr>
         <w:pStyle w:val="Heading2"/>
@@ -133,15 +136,8 @@
         <w:t xml:space="preserve">- Shaded region problems</w:t>
       </w:r>
     </w:p>
-    <w:p>
-      <w:r>
-        <w:pict>
-          <v:rect style="width:0;height:1.5pt" o:hralign="center" o:hrstd="t" o:hr="t"/>
-        </w:pict>
-      </w:r>
-    </w:p>
-    <w:bookmarkEnd w:id="20"/>
-    <w:bookmarkStart w:id="23" w:name="essential-formulas-theorems"/>
+    <w:bookmarkEnd w:id="21"/>
+    <w:bookmarkStart w:id="24" w:name="essential-formulas-theorems"/>
     <w:p>
       <w:pPr>
         <w:pStyle w:val="Heading2"/>
@@ -150,7 +146,7 @@
         <w:t xml:space="preserve">🎯 Essential Formulas &amp; Theorems</w:t>
       </w:r>
     </w:p>
-    <w:bookmarkStart w:id="21" w:name="basic-circle-formulas"/>
+    <w:bookmarkStart w:id="22" w:name="basic-circle-formulas"/>
     <w:p>
       <w:pPr>
         <w:pStyle w:val="Heading3"/>
@@ -390,15 +386,8 @@
         <w:t xml:space="preserve">180° = π radians</w:t>
       </w:r>
     </w:p>
-    <w:p>
-      <w:r>
-        <w:pict>
-          <v:rect style="width:0;height:1.5pt" o:hralign="center" o:hrstd="t" o:hr="t"/>
-        </w:pict>
-      </w:r>
-    </w:p>
-    <w:bookmarkEnd w:id="21"/>
-    <w:bookmarkStart w:id="22" w:name="equation-of-a-circle"/>
+    <w:bookmarkEnd w:id="22"/>
+    <w:bookmarkStart w:id="23" w:name="equation-of-a-circle"/>
     <w:p>
       <w:pPr>
         <w:pStyle w:val="Heading3"/>
@@ -630,16 +619,9 @@
         <w:t xml:space="preserve">(x + D/2)² + (y + E/2)² = (D/2)² + (E/2)² - F</w:t>
       </w:r>
     </w:p>
-    <w:p>
-      <w:r>
-        <w:pict>
-          <v:rect style="width:0;height:1.5pt" o:hralign="center" o:hrstd="t" o:hr="t"/>
-        </w:pict>
-      </w:r>
-    </w:p>
-    <w:bookmarkEnd w:id="22"/>
     <w:bookmarkEnd w:id="23"/>
-    <w:bookmarkStart w:id="24" w:name="central-inscribed-angles"/>
+    <w:bookmarkEnd w:id="24"/>
+    <w:bookmarkStart w:id="25" w:name="central-inscribed-angles"/>
     <w:p>
       <w:pPr>
         <w:pStyle w:val="Heading2"/>
@@ -1029,15 +1011,8 @@
         <w:t xml:space="preserve">.</w:t>
       </w:r>
     </w:p>
-    <w:p>
-      <w:r>
-        <w:pict>
-          <v:rect style="width:0;height:1.5pt" o:hralign="center" o:hrstd="t" o:hr="t"/>
-        </w:pict>
-      </w:r>
-    </w:p>
-    <w:bookmarkEnd w:id="24"/>
-    <w:bookmarkStart w:id="27" w:name="tangents-chords-secants"/>
+    <w:bookmarkEnd w:id="25"/>
+    <w:bookmarkStart w:id="28" w:name="tangents-chords-secants"/>
     <w:p>
       <w:pPr>
         <w:pStyle w:val="Heading2"/>
@@ -1046,7 +1021,7 @@
         <w:t xml:space="preserve">📐 Tangents, Chords, &amp; Secants</w:t>
       </w:r>
     </w:p>
-    <w:bookmarkStart w:id="25" w:name="tangent-properties"/>
+    <w:bookmarkStart w:id="26" w:name="tangent-properties"/>
     <w:p>
       <w:pPr>
         <w:pStyle w:val="Heading3"/>
@@ -1115,8 +1090,8 @@
         <w:t xml:space="preserve">= ½ intercepted arc</w:t>
       </w:r>
     </w:p>
-    <w:bookmarkEnd w:id="25"/>
-    <w:bookmarkStart w:id="26" w:name="power-of-a-point-unified-theorem"/>
+    <w:bookmarkEnd w:id="26"/>
+    <w:bookmarkStart w:id="27" w:name="power-of-a-point-unified-theorem"/>
     <w:p>
       <w:pPr>
         <w:pStyle w:val="Heading3"/>
@@ -1229,16 +1204,9 @@
         <w:t xml:space="preserve">- PA × PB = PC × PD (products of chord segments)</w:t>
       </w:r>
     </w:p>
-    <w:p>
-      <w:r>
-        <w:pict>
-          <v:rect style="width:0;height:1.5pt" o:hralign="center" o:hrstd="t" o:hr="t"/>
-        </w:pict>
-      </w:r>
-    </w:p>
-    <w:bookmarkEnd w:id="26"/>
     <w:bookmarkEnd w:id="27"/>
-    <w:bookmarkStart w:id="33" w:name="problem-solving-strategies"/>
+    <w:bookmarkEnd w:id="28"/>
+    <w:bookmarkStart w:id="34" w:name="problem-solving-strategies"/>
     <w:p>
       <w:pPr>
         <w:pStyle w:val="Heading2"/>
@@ -1247,7 +1215,7 @@
         <w:t xml:space="preserve">🏆 Problem-Solving Strategies</w:t>
       </w:r>
     </w:p>
-    <w:bookmarkStart w:id="28" w:name="strategy-1-draw-radii-to-tangency-points"/>
+    <w:bookmarkStart w:id="29" w:name="strategy-1-draw-radii-to-tangency-points"/>
     <w:p>
       <w:pPr>
         <w:pStyle w:val="Heading3"/>
@@ -1308,8 +1276,8 @@
         <w:t xml:space="preserve">Often reveals 30-60-90 or 45-45-90 triangles</w:t>
       </w:r>
     </w:p>
-    <w:bookmarkEnd w:id="28"/>
-    <w:bookmarkStart w:id="29" w:name="strategy-2-label-everything"/>
+    <w:bookmarkEnd w:id="29"/>
+    <w:bookmarkStart w:id="30" w:name="strategy-2-label-everything"/>
     <w:p>
       <w:pPr>
         <w:pStyle w:val="Heading3"/>
@@ -1366,8 +1334,8 @@
         <w:t xml:space="preserve">Arc measures</w:t>
       </w:r>
     </w:p>
-    <w:bookmarkEnd w:id="29"/>
-    <w:bookmarkStart w:id="30" w:name="strategy-3-coordinate-geometry"/>
+    <w:bookmarkEnd w:id="30"/>
+    <w:bookmarkStart w:id="31" w:name="strategy-3-coordinate-geometry"/>
     <w:p>
       <w:pPr>
         <w:pStyle w:val="Heading3"/>
@@ -1412,8 +1380,8 @@
         <w:t xml:space="preserve">Tangent slope = negative reciprocal of radius slope</w:t>
       </w:r>
     </w:p>
-    <w:bookmarkEnd w:id="30"/>
-    <w:bookmarkStart w:id="31" w:name="strategy-4-shaded-regions"/>
+    <w:bookmarkEnd w:id="31"/>
+    <w:bookmarkStart w:id="32" w:name="strategy-4-shaded-regions"/>
     <w:p>
       <w:pPr>
         <w:pStyle w:val="Heading3"/>
@@ -1452,8 +1420,8 @@
         <w:t xml:space="preserve">- Triangle = ½ × base × height</w:t>
       </w:r>
     </w:p>
-    <w:bookmarkEnd w:id="31"/>
-    <w:bookmarkStart w:id="32" w:name="strategy-5-power-of-a-point"/>
+    <w:bookmarkEnd w:id="32"/>
+    <w:bookmarkStart w:id="33" w:name="strategy-5-power-of-a-point"/>
     <w:p>
       <w:pPr>
         <w:pStyle w:val="Heading3"/>
@@ -1508,16 +1476,9 @@
         <w:t xml:space="preserve">: (whole)(external) = (tangent)²</w:t>
       </w:r>
     </w:p>
-    <w:p>
-      <w:r>
-        <w:pict>
-          <v:rect style="width:0;height:1.5pt" o:hralign="center" o:hrstd="t" o:hr="t"/>
-        </w:pict>
-      </w:r>
-    </w:p>
-    <w:bookmarkEnd w:id="32"/>
     <w:bookmarkEnd w:id="33"/>
-    <w:bookmarkStart w:id="44" w:name="practice-problems"/>
+    <w:bookmarkEnd w:id="34"/>
+    <w:bookmarkStart w:id="45" w:name="practice-problems"/>
     <w:p>
       <w:pPr>
         <w:pStyle w:val="Heading2"/>
@@ -1526,7 +1487,7 @@
         <w:t xml:space="preserve">🧮 Practice Problems</w:t>
       </w:r>
     </w:p>
-    <w:bookmarkStart w:id="34" w:name="X89cf7aa5dbe9bfa8131b361ca6d32e9f5e13aee"/>
+    <w:bookmarkStart w:id="35" w:name="X89cf7aa5dbe9bfa8131b361ca6d32e9f5e13aee"/>
     <w:p>
       <w:pPr>
         <w:pStyle w:val="Heading3"/>
@@ -1647,15 +1608,8 @@
         <w:t xml:space="preserve">5</w:t>
       </w:r>
     </w:p>
-    <w:p>
-      <w:r>
-        <w:pict>
-          <v:rect style="width:0;height:1.5pt" o:hralign="center" o:hrstd="t" o:hr="t"/>
-        </w:pict>
-      </w:r>
-    </w:p>
-    <w:bookmarkEnd w:id="34"/>
-    <w:bookmarkStart w:id="35" w:name="problem-2-tangent-line-slope"/>
+    <w:bookmarkEnd w:id="35"/>
+    <w:bookmarkStart w:id="36" w:name="problem-2-tangent-line-slope"/>
     <w:p>
       <w:pPr>
         <w:pStyle w:val="Heading3"/>
@@ -1760,15 +1714,8 @@
         <w:t xml:space="preserve">(negative reciprocal)</w:t>
       </w:r>
     </w:p>
-    <w:p>
-      <w:r>
-        <w:pict>
-          <v:rect style="width:0;height:1.5pt" o:hralign="center" o:hrstd="t" o:hr="t"/>
-        </w:pict>
-      </w:r>
-    </w:p>
-    <w:bookmarkEnd w:id="35"/>
-    <w:bookmarkStart w:id="36" w:name="problem-3-chord-length"/>
+    <w:bookmarkEnd w:id="36"/>
+    <w:bookmarkStart w:id="37" w:name="problem-3-chord-length"/>
     <w:p>
       <w:pPr>
         <w:pStyle w:val="Heading3"/>
@@ -1879,15 +1826,8 @@
         <w:t xml:space="preserve">Full chord = 16</w:t>
       </w:r>
     </w:p>
-    <w:p>
-      <w:r>
-        <w:pict>
-          <v:rect style="width:0;height:1.5pt" o:hralign="center" o:hrstd="t" o:hr="t"/>
-        </w:pict>
-      </w:r>
-    </w:p>
-    <w:bookmarkEnd w:id="36"/>
-    <w:bookmarkStart w:id="37" w:name="problem-4-sector-area-shaded-region"/>
+    <w:bookmarkEnd w:id="37"/>
+    <w:bookmarkStart w:id="38" w:name="problem-4-sector-area-shaded-region"/>
     <w:p>
       <w:pPr>
         <w:pStyle w:val="Heading3"/>
@@ -2010,15 +1950,8 @@
         <w:t xml:space="preserve">Shaded area = 27π - 81√3/4</w:t>
       </w:r>
     </w:p>
-    <w:p>
-      <w:r>
-        <w:pict>
-          <v:rect style="width:0;height:1.5pt" o:hralign="center" o:hrstd="t" o:hr="t"/>
-        </w:pict>
-      </w:r>
-    </w:p>
-    <w:bookmarkEnd w:id="37"/>
-    <w:bookmarkStart w:id="38" w:name="X336d906006d351ccdedb792d27ec3756581170f"/>
+    <w:bookmarkEnd w:id="38"/>
+    <w:bookmarkStart w:id="39" w:name="X336d906006d351ccdedb792d27ec3756581170f"/>
     <w:p>
       <w:pPr>
         <w:pStyle w:val="Heading3"/>
@@ -2104,15 +2037,8 @@
         <w:t xml:space="preserve">(External segment = PB - PA = 12)</w:t>
       </w:r>
     </w:p>
-    <w:p>
-      <w:r>
-        <w:pict>
-          <v:rect style="width:0;height:1.5pt" o:hralign="center" o:hrstd="t" o:hr="t"/>
-        </w:pict>
-      </w:r>
-    </w:p>
-    <w:bookmarkEnd w:id="38"/>
-    <w:bookmarkStart w:id="39" w:name="problem-6-inscribed-angle"/>
+    <w:bookmarkEnd w:id="39"/>
+    <w:bookmarkStart w:id="40" w:name="problem-6-inscribed-angle"/>
     <w:p>
       <w:pPr>
         <w:pStyle w:val="Heading3"/>
@@ -2192,15 +2118,8 @@
         <w:t xml:space="preserve">Arc AC = 80°</w:t>
       </w:r>
     </w:p>
-    <w:p>
-      <w:r>
-        <w:pict>
-          <v:rect style="width:0;height:1.5pt" o:hralign="center" o:hrstd="t" o:hr="t"/>
-        </w:pict>
-      </w:r>
-    </w:p>
-    <w:bookmarkEnd w:id="39"/>
-    <w:bookmarkStart w:id="40" w:name="problem-7-two-secants"/>
+    <w:bookmarkEnd w:id="40"/>
+    <w:bookmarkStart w:id="41" w:name="problem-7-two-secants"/>
     <w:p>
       <w:pPr>
         <w:pStyle w:val="Heading3"/>
@@ -2301,15 +2220,8 @@
         <w:t xml:space="preserve">3.5</w:t>
       </w:r>
     </w:p>
-    <w:p>
-      <w:r>
-        <w:pict>
-          <v:rect style="width:0;height:1.5pt" o:hralign="center" o:hrstd="t" o:hr="t"/>
-        </w:pict>
-      </w:r>
-    </w:p>
-    <w:bookmarkEnd w:id="40"/>
-    <w:bookmarkStart w:id="41" w:name="problem-8-circle-through-three-points"/>
+    <w:bookmarkEnd w:id="41"/>
+    <w:bookmarkStart w:id="42" w:name="problem-8-circle-through-three-points"/>
     <w:p>
       <w:pPr>
         <w:pStyle w:val="Heading3"/>
@@ -2426,15 +2338,8 @@
         <w:t xml:space="preserve">(x - 3)² + (y - 4)² = 25</w:t>
       </w:r>
     </w:p>
-    <w:p>
-      <w:r>
-        <w:pict>
-          <v:rect style="width:0;height:1.5pt" o:hralign="center" o:hrstd="t" o:hr="t"/>
-        </w:pict>
-      </w:r>
-    </w:p>
-    <w:bookmarkEnd w:id="41"/>
-    <w:bookmarkStart w:id="42" w:name="problem-9-arc-length"/>
+    <w:bookmarkEnd w:id="42"/>
+    <w:bookmarkStart w:id="43" w:name="problem-9-arc-length"/>
     <w:p>
       <w:pPr>
         <w:pStyle w:val="Heading3"/>
@@ -2521,15 +2426,8 @@
         <w:t xml:space="preserve">10π</w:t>
       </w:r>
     </w:p>
-    <w:p>
-      <w:r>
-        <w:pict>
-          <v:rect style="width:0;height:1.5pt" o:hralign="center" o:hrstd="t" o:hr="t"/>
-        </w:pict>
-      </w:r>
-    </w:p>
-    <w:bookmarkEnd w:id="42"/>
-    <w:bookmarkStart w:id="43" w:name="problem-10-inscribed-quadrilateral"/>
+    <w:bookmarkEnd w:id="43"/>
+    <w:bookmarkStart w:id="44" w:name="problem-10-inscribed-quadrilateral"/>
     <w:p>
       <w:pPr>
         <w:pStyle w:val="Heading3"/>
@@ -2622,16 +2520,9 @@
         <w:t xml:space="preserve">∠C = 110°</w:t>
       </w:r>
     </w:p>
-    <w:p>
-      <w:r>
-        <w:pict>
-          <v:rect style="width:0;height:1.5pt" o:hralign="center" o:hrstd="t" o:hr="t"/>
-        </w:pict>
-      </w:r>
-    </w:p>
-    <w:bookmarkEnd w:id="43"/>
     <w:bookmarkEnd w:id="44"/>
-    <w:bookmarkStart w:id="48" w:name="special-circle-configurations"/>
+    <w:bookmarkEnd w:id="45"/>
+    <w:bookmarkStart w:id="49" w:name="special-circle-configurations"/>
     <w:p>
       <w:pPr>
         <w:pStyle w:val="Heading2"/>
@@ -2640,7 +2531,7 @@
         <w:t xml:space="preserve">📐 Special Circle Configurations</w:t>
       </w:r>
     </w:p>
-    <w:bookmarkStart w:id="45" w:name="thales-theorem"/>
+    <w:bookmarkStart w:id="46" w:name="thales-theorem"/>
     <w:p>
       <w:pPr>
         <w:pStyle w:val="Heading3"/>
@@ -2673,8 +2564,8 @@
         <w:t xml:space="preserve">- Converse: Right triangle’s hypotenuse is diameter of circumscribed circle</w:t>
       </w:r>
     </w:p>
-    <w:bookmarkEnd w:id="45"/>
-    <w:bookmarkStart w:id="46" w:name="intersecting-chords-inside-circle"/>
+    <w:bookmarkEnd w:id="46"/>
+    <w:bookmarkStart w:id="47" w:name="intersecting-chords-inside-circle"/>
     <w:p>
       <w:pPr>
         <w:pStyle w:val="Heading3"/>
@@ -2701,8 +2592,8 @@
         <w:t xml:space="preserve">AP × PB = CP × PD</w:t>
       </w:r>
     </w:p>
-    <w:bookmarkEnd w:id="46"/>
-    <w:bookmarkStart w:id="47" w:name="common-tangents"/>
+    <w:bookmarkEnd w:id="47"/>
+    <w:bookmarkStart w:id="48" w:name="common-tangents"/>
     <w:p>
       <w:pPr>
         <w:pStyle w:val="Heading3"/>
@@ -2761,16 +2652,9 @@
         <w:t xml:space="preserve">Length formulas involve distance between centers and radii</w:t>
       </w:r>
     </w:p>
-    <w:p>
-      <w:r>
-        <w:pict>
-          <v:rect style="width:0;height:1.5pt" o:hralign="center" o:hrstd="t" o:hr="t"/>
-        </w:pict>
-      </w:r>
-    </w:p>
-    <w:bookmarkEnd w:id="47"/>
     <w:bookmarkEnd w:id="48"/>
-    <w:bookmarkStart w:id="52" w:name="dsat-specific-tips"/>
+    <w:bookmarkEnd w:id="49"/>
+    <w:bookmarkStart w:id="53" w:name="dsat-specific-tips"/>
     <w:p>
       <w:pPr>
         <w:pStyle w:val="Heading2"/>
@@ -2779,7 +2663,7 @@
         <w:t xml:space="preserve">🎯 DSAT-Specific Tips</w:t>
       </w:r>
     </w:p>
-    <w:bookmarkStart w:id="49" w:name="desmos-strategies"/>
+    <w:bookmarkStart w:id="50" w:name="desmos-strategies"/>
     <w:p>
       <w:pPr>
         <w:pStyle w:val="Heading3"/>
@@ -2864,8 +2748,8 @@
         <w:t xml:space="preserve">: Type r = 5, then (x-3)² + (y+2)² = r², add slider</w:t>
       </w:r>
     </w:p>
-    <w:bookmarkEnd w:id="49"/>
-    <w:bookmarkStart w:id="50" w:name="time-saving-techniques"/>
+    <w:bookmarkEnd w:id="50"/>
+    <w:bookmarkStart w:id="51" w:name="time-saving-techniques"/>
     <w:p>
       <w:pPr>
         <w:pStyle w:val="Heading3"/>
@@ -2959,8 +2843,8 @@
         <w:t xml:space="preserve">→ standard form in 30 seconds</w:t>
       </w:r>
     </w:p>
-    <w:bookmarkEnd w:id="50"/>
-    <w:bookmarkStart w:id="51" w:name="common-traps"/>
+    <w:bookmarkEnd w:id="51"/>
+    <w:bookmarkStart w:id="52" w:name="common-traps"/>
     <w:p>
       <w:pPr>
         <w:pStyle w:val="Heading3"/>
@@ -3204,16 +3088,9 @@
         </w:tc>
       </w:tr>
     </w:tbl>
-    <w:p>
-      <w:r>
-        <w:pict>
-          <v:rect style="width:0;height:1.5pt" o:hralign="center" o:hrstd="t" o:hr="t"/>
-        </w:pict>
-      </w:r>
-    </w:p>
-    <w:bookmarkEnd w:id="51"/>
     <w:bookmarkEnd w:id="52"/>
-    <w:bookmarkStart w:id="53" w:name="formula-quick-reference"/>
+    <w:bookmarkEnd w:id="53"/>
+    <w:bookmarkStart w:id="54" w:name="formula-quick-reference"/>
     <w:p>
       <w:pPr>
         <w:pStyle w:val="Heading2"/>
@@ -3803,15 +3680,8 @@
         </w:tc>
       </w:tr>
     </w:tbl>
-    <w:p>
-      <w:r>
-        <w:pict>
-          <v:rect style="width:0;height:1.5pt" o:hralign="center" o:hrstd="t" o:hr="t"/>
-        </w:pict>
-      </w:r>
-    </w:p>
-    <w:bookmarkEnd w:id="53"/>
-    <w:bookmarkStart w:id="54" w:name="error-checklist"/>
+    <w:bookmarkEnd w:id="54"/>
+    <w:bookmarkStart w:id="55" w:name="error-checklist"/>
     <w:p>
       <w:pPr>
         <w:pStyle w:val="Heading2"/>
@@ -3904,15 +3774,8 @@
         <w:t xml:space="preserve">☐ Units consistent? (Degrees vs radians)</w:t>
       </w:r>
     </w:p>
-    <w:p>
-      <w:r>
-        <w:pict>
-          <v:rect style="width:0;height:1.5pt" o:hralign="center" o:hrstd="t" o:hr="t"/>
-        </w:pict>
-      </w:r>
-    </w:p>
-    <w:bookmarkEnd w:id="54"/>
-    <w:bookmarkStart w:id="55" w:name="review-checklist"/>
+    <w:bookmarkEnd w:id="55"/>
+    <w:bookmarkStart w:id="56" w:name="review-checklist"/>
     <w:p>
       <w:pPr>
         <w:pStyle w:val="Heading2"/>
@@ -4066,13 +3929,6 @@
       </w:r>
     </w:p>
     <w:p>
-      <w:r>
-        <w:pict>
-          <v:rect style="width:0;height:1.5pt" o:hralign="center" o:hrstd="t" o:hr="t"/>
-        </w:pict>
-      </w:r>
-    </w:p>
-    <w:p>
       <w:pPr>
         <w:pStyle w:val="FirstParagraph"/>
       </w:pPr>
@@ -4084,8 +3940,2308 @@
         <w:t xml:space="preserve">Last Updated: 2026-07-11 | Source: 2026 Summer SAT/ACT @ AHA classroom materials</w:t>
       </w:r>
     </w:p>
-    <w:bookmarkEnd w:id="55"/>
     <w:bookmarkEnd w:id="56"/>
+    <w:bookmarkStart w:id="60" w:name="X58db33e47549cc79f09b06311974d73a8700830"/>
+    <w:p>
+      <w:pPr>
+        <w:pStyle w:val="Heading2"/>
+      </w:pPr>
+      <w:r>
+        <w:t xml:space="preserve">📅 Update: 2026-07-13 - New Circle Concepts from 19_Circles.pdf &amp; SAT Geometry Problems</w:t>
+      </w:r>
+    </w:p>
+    <w:bookmarkStart w:id="57" w:name="X45bfd9c2ab889672e79448cb6f65c075a2da1a6"/>
+    <w:p>
+      <w:pPr>
+        <w:pStyle w:val="Heading3"/>
+      </w:pPr>
+      <w:r>
+        <w:t xml:space="preserve">Circle Equations: General to Standard Form (Deep Dive)</w:t>
+      </w:r>
+    </w:p>
+    <w:p>
+      <w:pPr>
+        <w:pStyle w:val="FirstParagraph"/>
+      </w:pPr>
+      <w:r>
+        <w:rPr>
+          <w:b/>
+          <w:bCs/>
+        </w:rPr>
+        <w:t xml:space="preserve">Given:</w:t>
+      </w:r>
+      <w:r>
+        <w:t xml:space="preserve"> </w:t>
+      </w:r>
+      <m:oMath>
+        <m:sSup>
+          <m:e>
+            <m:r>
+              <m:t>x</m:t>
+            </m:r>
+          </m:e>
+          <m:sup>
+            <m:r>
+              <m:t>2</m:t>
+            </m:r>
+          </m:sup>
+        </m:sSup>
+        <m:r>
+          <m:rPr>
+            <m:sty m:val="p"/>
+          </m:rPr>
+          <m:t>+</m:t>
+        </m:r>
+        <m:sSup>
+          <m:e>
+            <m:r>
+              <m:t>y</m:t>
+            </m:r>
+          </m:e>
+          <m:sup>
+            <m:r>
+              <m:t>2</m:t>
+            </m:r>
+          </m:sup>
+        </m:sSup>
+        <m:r>
+          <m:rPr>
+            <m:sty m:val="p"/>
+          </m:rPr>
+          <m:t>+</m:t>
+        </m:r>
+        <m:r>
+          <m:t>D</m:t>
+        </m:r>
+        <m:r>
+          <m:t>x</m:t>
+        </m:r>
+        <m:r>
+          <m:rPr>
+            <m:sty m:val="p"/>
+          </m:rPr>
+          <m:t>+</m:t>
+        </m:r>
+        <m:r>
+          <m:t>E</m:t>
+        </m:r>
+        <m:r>
+          <m:t>y</m:t>
+        </m:r>
+        <m:r>
+          <m:rPr>
+            <m:sty m:val="p"/>
+          </m:rPr>
+          <m:t>+</m:t>
+        </m:r>
+        <m:r>
+          <m:t>F</m:t>
+        </m:r>
+        <m:r>
+          <m:rPr>
+            <m:sty m:val="p"/>
+          </m:rPr>
+          <m:t>=</m:t>
+        </m:r>
+        <m:r>
+          <m:t>0</m:t>
+        </m:r>
+      </m:oMath>
+    </w:p>
+    <w:p>
+      <w:pPr>
+        <w:pStyle w:val="BodyText"/>
+      </w:pPr>
+      <w:r>
+        <w:rPr>
+          <w:b/>
+          <w:bCs/>
+        </w:rPr>
+        <w:t xml:space="preserve">Complete the Square:</w:t>
+      </w:r>
+      <w:r>
+        <w:t xml:space="preserve"> </w:t>
+      </w:r>
+      <w:r>
+        <w:t xml:space="preserve">1. Group:</w:t>
+      </w:r>
+      <w:r>
+        <w:t xml:space="preserve"> </w:t>
+      </w:r>
+      <m:oMath>
+        <m:d>
+          <m:dPr>
+            <m:begChr m:val="("/>
+            <m:endChr m:val=")"/>
+            <m:sepChr m:val=""/>
+            <m:grow/>
+          </m:dPr>
+          <m:e>
+            <m:sSup>
+              <m:e>
+                <m:r>
+                  <m:t>x</m:t>
+                </m:r>
+              </m:e>
+              <m:sup>
+                <m:r>
+                  <m:t>2</m:t>
+                </m:r>
+              </m:sup>
+            </m:sSup>
+            <m:r>
+              <m:rPr>
+                <m:sty m:val="p"/>
+              </m:rPr>
+              <m:t>+</m:t>
+            </m:r>
+            <m:r>
+              <m:t>D</m:t>
+            </m:r>
+            <m:r>
+              <m:t>x</m:t>
+            </m:r>
+          </m:e>
+        </m:d>
+        <m:r>
+          <m:rPr>
+            <m:sty m:val="p"/>
+          </m:rPr>
+          <m:t>+</m:t>
+        </m:r>
+        <m:d>
+          <m:dPr>
+            <m:begChr m:val="("/>
+            <m:endChr m:val=")"/>
+            <m:sepChr m:val=""/>
+            <m:grow/>
+          </m:dPr>
+          <m:e>
+            <m:sSup>
+              <m:e>
+                <m:r>
+                  <m:t>y</m:t>
+                </m:r>
+              </m:e>
+              <m:sup>
+                <m:r>
+                  <m:t>2</m:t>
+                </m:r>
+              </m:sup>
+            </m:sSup>
+            <m:r>
+              <m:rPr>
+                <m:sty m:val="p"/>
+              </m:rPr>
+              <m:t>+</m:t>
+            </m:r>
+            <m:r>
+              <m:t>E</m:t>
+            </m:r>
+            <m:r>
+              <m:t>y</m:t>
+            </m:r>
+          </m:e>
+        </m:d>
+        <m:r>
+          <m:rPr>
+            <m:sty m:val="p"/>
+          </m:rPr>
+          <m:t>=</m:t>
+        </m:r>
+        <m:r>
+          <m:rPr>
+            <m:sty m:val="p"/>
+          </m:rPr>
+          <m:t>−</m:t>
+        </m:r>
+        <m:r>
+          <m:t>F</m:t>
+        </m:r>
+      </m:oMath>
+      <w:r>
+        <w:t xml:space="preserve"> </w:t>
+      </w:r>
+      <w:r>
+        <w:t xml:space="preserve">2. Add</w:t>
+      </w:r>
+      <w:r>
+        <w:t xml:space="preserve"> </w:t>
+      </w:r>
+      <m:oMath>
+        <m:sSup>
+          <m:e>
+            <m:d>
+              <m:dPr>
+                <m:begChr m:val="("/>
+                <m:endChr m:val=")"/>
+                <m:sepChr m:val=""/>
+                <m:grow/>
+              </m:dPr>
+              <m:e>
+                <m:r>
+                  <m:t>D</m:t>
+                </m:r>
+                <m:r>
+                  <m:rPr>
+                    <m:sty m:val="p"/>
+                  </m:rPr>
+                  <m:t>/</m:t>
+                </m:r>
+                <m:r>
+                  <m:t>2</m:t>
+                </m:r>
+              </m:e>
+            </m:d>
+          </m:e>
+          <m:sup>
+            <m:r>
+              <m:t>2</m:t>
+            </m:r>
+          </m:sup>
+        </m:sSup>
+      </m:oMath>
+      <w:r>
+        <w:t xml:space="preserve"> </w:t>
+      </w:r>
+      <w:r>
+        <w:t xml:space="preserve">and</w:t>
+      </w:r>
+      <w:r>
+        <w:t xml:space="preserve"> </w:t>
+      </w:r>
+      <m:oMath>
+        <m:sSup>
+          <m:e>
+            <m:d>
+              <m:dPr>
+                <m:begChr m:val="("/>
+                <m:endChr m:val=")"/>
+                <m:sepChr m:val=""/>
+                <m:grow/>
+              </m:dPr>
+              <m:e>
+                <m:r>
+                  <m:t>E</m:t>
+                </m:r>
+                <m:r>
+                  <m:rPr>
+                    <m:sty m:val="p"/>
+                  </m:rPr>
+                  <m:t>/</m:t>
+                </m:r>
+                <m:r>
+                  <m:t>2</m:t>
+                </m:r>
+              </m:e>
+            </m:d>
+          </m:e>
+          <m:sup>
+            <m:r>
+              <m:t>2</m:t>
+            </m:r>
+          </m:sup>
+        </m:sSup>
+      </m:oMath>
+      <w:r>
+        <w:t xml:space="preserve"> </w:t>
+      </w:r>
+      <w:r>
+        <w:t xml:space="preserve">to both sides</w:t>
+      </w:r>
+      <w:r>
+        <w:t xml:space="preserve"> </w:t>
+      </w:r>
+      <w:r>
+        <w:t xml:space="preserve">3.</w:t>
+      </w:r>
+      <w:r>
+        <w:t xml:space="preserve"> </w:t>
+      </w:r>
+      <m:oMath>
+        <m:sSup>
+          <m:e>
+            <m:d>
+              <m:dPr>
+                <m:begChr m:val="("/>
+                <m:endChr m:val=")"/>
+                <m:sepChr m:val=""/>
+                <m:grow/>
+              </m:dPr>
+              <m:e>
+                <m:r>
+                  <m:t>x</m:t>
+                </m:r>
+                <m:r>
+                  <m:rPr>
+                    <m:sty m:val="p"/>
+                  </m:rPr>
+                  <m:t>+</m:t>
+                </m:r>
+                <m:r>
+                  <m:t>D</m:t>
+                </m:r>
+                <m:r>
+                  <m:rPr>
+                    <m:sty m:val="p"/>
+                  </m:rPr>
+                  <m:t>/</m:t>
+                </m:r>
+                <m:r>
+                  <m:t>2</m:t>
+                </m:r>
+              </m:e>
+            </m:d>
+          </m:e>
+          <m:sup>
+            <m:r>
+              <m:t>2</m:t>
+            </m:r>
+          </m:sup>
+        </m:sSup>
+        <m:r>
+          <m:rPr>
+            <m:sty m:val="p"/>
+          </m:rPr>
+          <m:t>+</m:t>
+        </m:r>
+        <m:sSup>
+          <m:e>
+            <m:d>
+              <m:dPr>
+                <m:begChr m:val="("/>
+                <m:endChr m:val=")"/>
+                <m:sepChr m:val=""/>
+                <m:grow/>
+              </m:dPr>
+              <m:e>
+                <m:r>
+                  <m:t>y</m:t>
+                </m:r>
+                <m:r>
+                  <m:rPr>
+                    <m:sty m:val="p"/>
+                  </m:rPr>
+                  <m:t>+</m:t>
+                </m:r>
+                <m:r>
+                  <m:t>E</m:t>
+                </m:r>
+                <m:r>
+                  <m:rPr>
+                    <m:sty m:val="p"/>
+                  </m:rPr>
+                  <m:t>/</m:t>
+                </m:r>
+                <m:r>
+                  <m:t>2</m:t>
+                </m:r>
+              </m:e>
+            </m:d>
+          </m:e>
+          <m:sup>
+            <m:r>
+              <m:t>2</m:t>
+            </m:r>
+          </m:sup>
+        </m:sSup>
+        <m:r>
+          <m:rPr>
+            <m:sty m:val="p"/>
+          </m:rPr>
+          <m:t>=</m:t>
+        </m:r>
+        <m:sSup>
+          <m:e>
+            <m:d>
+              <m:dPr>
+                <m:begChr m:val="("/>
+                <m:endChr m:val=")"/>
+                <m:sepChr m:val=""/>
+                <m:grow/>
+              </m:dPr>
+              <m:e>
+                <m:r>
+                  <m:t>D</m:t>
+                </m:r>
+                <m:r>
+                  <m:rPr>
+                    <m:sty m:val="p"/>
+                  </m:rPr>
+                  <m:t>/</m:t>
+                </m:r>
+                <m:r>
+                  <m:t>2</m:t>
+                </m:r>
+              </m:e>
+            </m:d>
+          </m:e>
+          <m:sup>
+            <m:r>
+              <m:t>2</m:t>
+            </m:r>
+          </m:sup>
+        </m:sSup>
+        <m:r>
+          <m:rPr>
+            <m:sty m:val="p"/>
+          </m:rPr>
+          <m:t>+</m:t>
+        </m:r>
+        <m:sSup>
+          <m:e>
+            <m:d>
+              <m:dPr>
+                <m:begChr m:val="("/>
+                <m:endChr m:val=")"/>
+                <m:sepChr m:val=""/>
+                <m:grow/>
+              </m:dPr>
+              <m:e>
+                <m:r>
+                  <m:t>E</m:t>
+                </m:r>
+                <m:r>
+                  <m:rPr>
+                    <m:sty m:val="p"/>
+                  </m:rPr>
+                  <m:t>/</m:t>
+                </m:r>
+                <m:r>
+                  <m:t>2</m:t>
+                </m:r>
+              </m:e>
+            </m:d>
+          </m:e>
+          <m:sup>
+            <m:r>
+              <m:t>2</m:t>
+            </m:r>
+          </m:sup>
+        </m:sSup>
+        <m:r>
+          <m:rPr>
+            <m:sty m:val="p"/>
+          </m:rPr>
+          <m:t>−</m:t>
+        </m:r>
+        <m:r>
+          <m:t>F</m:t>
+        </m:r>
+      </m:oMath>
+    </w:p>
+    <w:p>
+      <w:pPr>
+        <w:pStyle w:val="BodyText"/>
+      </w:pPr>
+      <w:r>
+        <w:rPr>
+          <w:b/>
+          <w:bCs/>
+        </w:rPr>
+        <w:t xml:space="preserve">Center:</w:t>
+      </w:r>
+      <w:r>
+        <w:t xml:space="preserve"> </w:t>
+      </w:r>
+      <m:oMath>
+        <m:d>
+          <m:dPr>
+            <m:begChr m:val="("/>
+            <m:endChr m:val=")"/>
+            <m:sepChr m:val=""/>
+            <m:grow/>
+          </m:dPr>
+          <m:e>
+            <m:r>
+              <m:rPr>
+                <m:sty m:val="p"/>
+              </m:rPr>
+              <m:t>−</m:t>
+            </m:r>
+            <m:r>
+              <m:t>D</m:t>
+            </m:r>
+            <m:r>
+              <m:rPr>
+                <m:sty m:val="p"/>
+              </m:rPr>
+              <m:t>/</m:t>
+            </m:r>
+            <m:r>
+              <m:t>2</m:t>
+            </m:r>
+            <m:r>
+              <m:rPr>
+                <m:sty m:val="p"/>
+              </m:rPr>
+              <m:t>,</m:t>
+            </m:r>
+            <m:r>
+              <m:rPr>
+                <m:sty m:val="p"/>
+              </m:rPr>
+              <m:t>−</m:t>
+            </m:r>
+            <m:r>
+              <m:t>E</m:t>
+            </m:r>
+            <m:r>
+              <m:rPr>
+                <m:sty m:val="p"/>
+              </m:rPr>
+              <m:t>/</m:t>
+            </m:r>
+            <m:r>
+              <m:t>2</m:t>
+            </m:r>
+          </m:e>
+        </m:d>
+      </m:oMath>
+      <w:r>
+        <w:t xml:space="preserve"> </w:t>
+      </w:r>
+      <w:r>
+        <w:rPr>
+          <w:b/>
+          <w:bCs/>
+        </w:rPr>
+        <w:t xml:space="preserve">Radius:</w:t>
+      </w:r>
+      <w:r>
+        <w:t xml:space="preserve"> </w:t>
+      </w:r>
+      <m:oMath>
+        <m:rad>
+          <m:radPr>
+            <m:degHide m:val="on"/>
+          </m:radPr>
+          <m:deg/>
+          <m:e>
+            <m:sSup>
+              <m:e>
+                <m:d>
+                  <m:dPr>
+                    <m:begChr m:val="("/>
+                    <m:endChr m:val=")"/>
+                    <m:sepChr m:val=""/>
+                    <m:grow/>
+                  </m:dPr>
+                  <m:e>
+                    <m:r>
+                      <m:t>D</m:t>
+                    </m:r>
+                    <m:r>
+                      <m:rPr>
+                        <m:sty m:val="p"/>
+                      </m:rPr>
+                      <m:t>/</m:t>
+                    </m:r>
+                    <m:r>
+                      <m:t>2</m:t>
+                    </m:r>
+                  </m:e>
+                </m:d>
+              </m:e>
+              <m:sup>
+                <m:r>
+                  <m:t>2</m:t>
+                </m:r>
+              </m:sup>
+            </m:sSup>
+            <m:r>
+              <m:rPr>
+                <m:sty m:val="p"/>
+              </m:rPr>
+              <m:t>+</m:t>
+            </m:r>
+            <m:sSup>
+              <m:e>
+                <m:d>
+                  <m:dPr>
+                    <m:begChr m:val="("/>
+                    <m:endChr m:val=")"/>
+                    <m:sepChr m:val=""/>
+                    <m:grow/>
+                  </m:dPr>
+                  <m:e>
+                    <m:r>
+                      <m:t>E</m:t>
+                    </m:r>
+                    <m:r>
+                      <m:rPr>
+                        <m:sty m:val="p"/>
+                      </m:rPr>
+                      <m:t>/</m:t>
+                    </m:r>
+                    <m:r>
+                      <m:t>2</m:t>
+                    </m:r>
+                  </m:e>
+                </m:d>
+              </m:e>
+              <m:sup>
+                <m:r>
+                  <m:t>2</m:t>
+                </m:r>
+              </m:sup>
+            </m:sSup>
+            <m:r>
+              <m:rPr>
+                <m:sty m:val="p"/>
+              </m:rPr>
+              <m:t>−</m:t>
+            </m:r>
+            <m:r>
+              <m:t>F</m:t>
+            </m:r>
+          </m:e>
+        </m:rad>
+      </m:oMath>
+    </w:p>
+    <w:p>
+      <w:pPr>
+        <w:pStyle w:val="BodyText"/>
+      </w:pPr>
+      <w:r>
+        <w:rPr>
+          <w:b/>
+          <w:bCs/>
+        </w:rPr>
+        <w:t xml:space="preserve">Example:</w:t>
+      </w:r>
+      <w:r>
+        <w:t xml:space="preserve"> </w:t>
+      </w:r>
+      <m:oMath>
+        <m:sSup>
+          <m:e>
+            <m:r>
+              <m:t>x</m:t>
+            </m:r>
+          </m:e>
+          <m:sup>
+            <m:r>
+              <m:t>2</m:t>
+            </m:r>
+          </m:sup>
+        </m:sSup>
+        <m:r>
+          <m:rPr>
+            <m:sty m:val="p"/>
+          </m:rPr>
+          <m:t>+</m:t>
+        </m:r>
+        <m:sSup>
+          <m:e>
+            <m:r>
+              <m:t>y</m:t>
+            </m:r>
+          </m:e>
+          <m:sup>
+            <m:r>
+              <m:t>2</m:t>
+            </m:r>
+          </m:sup>
+        </m:sSup>
+        <m:r>
+          <m:rPr>
+            <m:sty m:val="p"/>
+          </m:rPr>
+          <m:t>−</m:t>
+        </m:r>
+        <m:r>
+          <m:t>10</m:t>
+        </m:r>
+        <m:r>
+          <m:t>x</m:t>
+        </m:r>
+        <m:r>
+          <m:rPr>
+            <m:sty m:val="p"/>
+          </m:rPr>
+          <m:t>+</m:t>
+        </m:r>
+        <m:r>
+          <m:t>6</m:t>
+        </m:r>
+        <m:r>
+          <m:t>y</m:t>
+        </m:r>
+        <m:r>
+          <m:rPr>
+            <m:sty m:val="p"/>
+          </m:rPr>
+          <m:t>+</m:t>
+        </m:r>
+        <m:r>
+          <m:t>18</m:t>
+        </m:r>
+        <m:r>
+          <m:rPr>
+            <m:sty m:val="p"/>
+          </m:rPr>
+          <m:t>=</m:t>
+        </m:r>
+        <m:r>
+          <m:t>0</m:t>
+        </m:r>
+      </m:oMath>
+      <w:r>
+        <w:t xml:space="preserve"> </w:t>
+      </w:r>
+      <w:r>
+        <w:t xml:space="preserve">-</w:t>
+      </w:r>
+      <w:r>
+        <w:t xml:space="preserve"> </w:t>
+      </w:r>
+      <m:oMath>
+        <m:d>
+          <m:dPr>
+            <m:begChr m:val="("/>
+            <m:endChr m:val=")"/>
+            <m:sepChr m:val=""/>
+            <m:grow/>
+          </m:dPr>
+          <m:e>
+            <m:sSup>
+              <m:e>
+                <m:r>
+                  <m:t>x</m:t>
+                </m:r>
+              </m:e>
+              <m:sup>
+                <m:r>
+                  <m:t>2</m:t>
+                </m:r>
+              </m:sup>
+            </m:sSup>
+            <m:r>
+              <m:rPr>
+                <m:sty m:val="p"/>
+              </m:rPr>
+              <m:t>−</m:t>
+            </m:r>
+            <m:r>
+              <m:t>10</m:t>
+            </m:r>
+            <m:r>
+              <m:t>x</m:t>
+            </m:r>
+          </m:e>
+        </m:d>
+        <m:r>
+          <m:rPr>
+            <m:sty m:val="p"/>
+          </m:rPr>
+          <m:t>+</m:t>
+        </m:r>
+        <m:d>
+          <m:dPr>
+            <m:begChr m:val="("/>
+            <m:endChr m:val=")"/>
+            <m:sepChr m:val=""/>
+            <m:grow/>
+          </m:dPr>
+          <m:e>
+            <m:sSup>
+              <m:e>
+                <m:r>
+                  <m:t>y</m:t>
+                </m:r>
+              </m:e>
+              <m:sup>
+                <m:r>
+                  <m:t>2</m:t>
+                </m:r>
+              </m:sup>
+            </m:sSup>
+            <m:r>
+              <m:rPr>
+                <m:sty m:val="p"/>
+              </m:rPr>
+              <m:t>+</m:t>
+            </m:r>
+            <m:r>
+              <m:t>6</m:t>
+            </m:r>
+            <m:r>
+              <m:t>y</m:t>
+            </m:r>
+          </m:e>
+        </m:d>
+        <m:r>
+          <m:rPr>
+            <m:sty m:val="p"/>
+          </m:rPr>
+          <m:t>=</m:t>
+        </m:r>
+        <m:r>
+          <m:rPr>
+            <m:sty m:val="p"/>
+          </m:rPr>
+          <m:t>−</m:t>
+        </m:r>
+        <m:r>
+          <m:t>18</m:t>
+        </m:r>
+      </m:oMath>
+      <w:r>
+        <w:t xml:space="preserve"> </w:t>
+      </w:r>
+      <w:r>
+        <w:t xml:space="preserve">-</w:t>
+      </w:r>
+      <w:r>
+        <w:t xml:space="preserve"> </w:t>
+      </w:r>
+      <m:oMath>
+        <m:sSup>
+          <m:e>
+            <m:d>
+              <m:dPr>
+                <m:begChr m:val="("/>
+                <m:endChr m:val=")"/>
+                <m:sepChr m:val=""/>
+                <m:grow/>
+              </m:dPr>
+              <m:e>
+                <m:r>
+                  <m:t>x</m:t>
+                </m:r>
+                <m:r>
+                  <m:rPr>
+                    <m:sty m:val="p"/>
+                  </m:rPr>
+                  <m:t>−</m:t>
+                </m:r>
+                <m:r>
+                  <m:t>5</m:t>
+                </m:r>
+              </m:e>
+            </m:d>
+          </m:e>
+          <m:sup>
+            <m:r>
+              <m:t>2</m:t>
+            </m:r>
+          </m:sup>
+        </m:sSup>
+        <m:r>
+          <m:rPr>
+            <m:sty m:val="p"/>
+          </m:rPr>
+          <m:t>−</m:t>
+        </m:r>
+        <m:r>
+          <m:t>25</m:t>
+        </m:r>
+        <m:r>
+          <m:rPr>
+            <m:sty m:val="p"/>
+          </m:rPr>
+          <m:t>+</m:t>
+        </m:r>
+        <m:sSup>
+          <m:e>
+            <m:d>
+              <m:dPr>
+                <m:begChr m:val="("/>
+                <m:endChr m:val=")"/>
+                <m:sepChr m:val=""/>
+                <m:grow/>
+              </m:dPr>
+              <m:e>
+                <m:r>
+                  <m:t>y</m:t>
+                </m:r>
+                <m:r>
+                  <m:rPr>
+                    <m:sty m:val="p"/>
+                  </m:rPr>
+                  <m:t>+</m:t>
+                </m:r>
+                <m:r>
+                  <m:t>3</m:t>
+                </m:r>
+              </m:e>
+            </m:d>
+          </m:e>
+          <m:sup>
+            <m:r>
+              <m:t>2</m:t>
+            </m:r>
+          </m:sup>
+        </m:sSup>
+        <m:r>
+          <m:rPr>
+            <m:sty m:val="p"/>
+          </m:rPr>
+          <m:t>−</m:t>
+        </m:r>
+        <m:r>
+          <m:t>9</m:t>
+        </m:r>
+        <m:r>
+          <m:rPr>
+            <m:sty m:val="p"/>
+          </m:rPr>
+          <m:t>=</m:t>
+        </m:r>
+        <m:r>
+          <m:rPr>
+            <m:sty m:val="p"/>
+          </m:rPr>
+          <m:t>−</m:t>
+        </m:r>
+        <m:r>
+          <m:t>18</m:t>
+        </m:r>
+      </m:oMath>
+      <w:r>
+        <w:t xml:space="preserve"> </w:t>
+      </w:r>
+      <w:r>
+        <w:t xml:space="preserve">-</w:t>
+      </w:r>
+      <w:r>
+        <w:t xml:space="preserve"> </w:t>
+      </w:r>
+      <m:oMath>
+        <m:sSup>
+          <m:e>
+            <m:d>
+              <m:dPr>
+                <m:begChr m:val="("/>
+                <m:endChr m:val=")"/>
+                <m:sepChr m:val=""/>
+                <m:grow/>
+              </m:dPr>
+              <m:e>
+                <m:r>
+                  <m:t>x</m:t>
+                </m:r>
+                <m:r>
+                  <m:rPr>
+                    <m:sty m:val="p"/>
+                  </m:rPr>
+                  <m:t>−</m:t>
+                </m:r>
+                <m:r>
+                  <m:t>5</m:t>
+                </m:r>
+              </m:e>
+            </m:d>
+          </m:e>
+          <m:sup>
+            <m:r>
+              <m:t>2</m:t>
+            </m:r>
+          </m:sup>
+        </m:sSup>
+        <m:r>
+          <m:rPr>
+            <m:sty m:val="p"/>
+          </m:rPr>
+          <m:t>+</m:t>
+        </m:r>
+        <m:sSup>
+          <m:e>
+            <m:d>
+              <m:dPr>
+                <m:begChr m:val="("/>
+                <m:endChr m:val=")"/>
+                <m:sepChr m:val=""/>
+                <m:grow/>
+              </m:dPr>
+              <m:e>
+                <m:r>
+                  <m:t>y</m:t>
+                </m:r>
+                <m:r>
+                  <m:rPr>
+                    <m:sty m:val="p"/>
+                  </m:rPr>
+                  <m:t>+</m:t>
+                </m:r>
+                <m:r>
+                  <m:t>3</m:t>
+                </m:r>
+              </m:e>
+            </m:d>
+          </m:e>
+          <m:sup>
+            <m:r>
+              <m:t>2</m:t>
+            </m:r>
+          </m:sup>
+        </m:sSup>
+        <m:r>
+          <m:rPr>
+            <m:sty m:val="p"/>
+          </m:rPr>
+          <m:t>=</m:t>
+        </m:r>
+        <m:r>
+          <m:t>16</m:t>
+        </m:r>
+      </m:oMath>
+      <w:r>
+        <w:t xml:space="preserve"> </w:t>
+      </w:r>
+      <w:r>
+        <w:t xml:space="preserve">-</w:t>
+      </w:r>
+      <w:r>
+        <w:t xml:space="preserve"> </w:t>
+      </w:r>
+      <w:r>
+        <w:rPr>
+          <w:b/>
+          <w:bCs/>
+        </w:rPr>
+        <w:t xml:space="preserve">Center:</w:t>
+      </w:r>
+      <w:r>
+        <w:rPr>
+          <w:b/>
+          <w:bCs/>
+        </w:rPr>
+        <w:t xml:space="preserve"> </w:t>
+      </w:r>
+      <m:oMath>
+        <m:d>
+          <m:dPr>
+            <m:begChr m:val="("/>
+            <m:endChr m:val=")"/>
+            <m:sepChr m:val=""/>
+            <m:grow/>
+          </m:dPr>
+          <m:e>
+            <m:r>
+              <m:t>5</m:t>
+            </m:r>
+            <m:r>
+              <m:rPr>
+                <m:sty m:val="p"/>
+              </m:rPr>
+              <m:t>,</m:t>
+            </m:r>
+            <m:r>
+              <m:rPr>
+                <m:sty m:val="p"/>
+              </m:rPr>
+              <m:t>−</m:t>
+            </m:r>
+            <m:r>
+              <m:t>3</m:t>
+            </m:r>
+          </m:e>
+        </m:d>
+      </m:oMath>
+      <w:r>
+        <w:rPr>
+          <w:b/>
+          <w:bCs/>
+        </w:rPr>
+        <w:t xml:space="preserve">, Radius:</w:t>
+      </w:r>
+      <w:r>
+        <w:rPr>
+          <w:b/>
+          <w:bCs/>
+        </w:rPr>
+        <w:t xml:space="preserve"> </w:t>
+      </w:r>
+      <m:oMath>
+        <m:r>
+          <m:t>4</m:t>
+        </m:r>
+      </m:oMath>
+    </w:p>
+    <w:bookmarkEnd w:id="57"/>
+    <w:bookmarkStart w:id="58" w:name="advanced-circle-theorems-from-classroom"/>
+    <w:p>
+      <w:pPr>
+        <w:pStyle w:val="Heading3"/>
+      </w:pPr>
+      <w:r>
+        <w:t xml:space="preserve">Advanced Circle Theorems from Classroom</w:t>
+      </w:r>
+    </w:p>
+    <w:tbl>
+      <w:tblPr>
+        <w:tblStyle w:val="Table"/>
+        <w:tblW w:type="pct" w:w="5000"/>
+        <w:jc w:val="left"/>
+        <w:tblLayout w:type="fixed"/>
+        <w:tblLook w:firstRow="1" w:lastRow="0" w:firstColumn="0" w:lastColumn="0" w:noHBand="0" w:noVBand="0" w:val="0020"/>
+      </w:tblPr>
+      <w:tblGrid>
+        <w:gridCol w:w="2299"/>
+        <w:gridCol w:w="2299"/>
+        <w:gridCol w:w="3321"/>
+      </w:tblGrid>
+      <w:tr>
+        <w:trPr>
+          <w:tblHeader w:val="on"/>
+        </w:trPr>
+        <w:tc>
+          <w:tcPr/>
+          <w:p>
+            <w:pPr>
+              <w:pStyle w:val="Compact"/>
+              <w:jc w:val="left"/>
+            </w:pPr>
+            <w:r>
+              <w:t xml:space="preserve">Theorem</w:t>
+            </w:r>
+          </w:p>
+        </w:tc>
+        <w:tc>
+          <w:tcPr/>
+          <w:p>
+            <w:pPr>
+              <w:pStyle w:val="Compact"/>
+              <w:jc w:val="left"/>
+            </w:pPr>
+            <w:r>
+              <w:t xml:space="preserve">Formula</w:t>
+            </w:r>
+          </w:p>
+        </w:tc>
+        <w:tc>
+          <w:tcPr/>
+          <w:p>
+            <w:pPr>
+              <w:pStyle w:val="Compact"/>
+              <w:jc w:val="left"/>
+            </w:pPr>
+            <w:r>
+              <w:t xml:space="preserve">When to Use</w:t>
+            </w:r>
+          </w:p>
+        </w:tc>
+      </w:tr>
+      <w:tr>
+        <w:tc>
+          <w:tcPr/>
+          <w:p>
+            <w:pPr>
+              <w:pStyle w:val="Compact"/>
+              <w:jc w:val="left"/>
+            </w:pPr>
+            <w:r>
+              <w:rPr>
+                <w:b/>
+                <w:bCs/>
+              </w:rPr>
+              <w:t xml:space="preserve">Chord-Chord (inside)</w:t>
+            </w:r>
+          </w:p>
+        </w:tc>
+        <w:tc>
+          <w:tcPr/>
+          <w:p>
+            <w:pPr>
+              <w:pStyle w:val="Compact"/>
+              <w:jc w:val="left"/>
+            </w:pPr>
+            <m:oMath>
+              <m:r>
+                <m:t>A</m:t>
+              </m:r>
+              <m:r>
+                <m:t>P</m:t>
+              </m:r>
+              <m:r>
+                <m:rPr>
+                  <m:sty m:val="p"/>
+                </m:rPr>
+                <m:t>×</m:t>
+              </m:r>
+              <m:r>
+                <m:t>P</m:t>
+              </m:r>
+              <m:r>
+                <m:t>B</m:t>
+              </m:r>
+              <m:r>
+                <m:rPr>
+                  <m:sty m:val="p"/>
+                </m:rPr>
+                <m:t>=</m:t>
+              </m:r>
+              <m:r>
+                <m:t>C</m:t>
+              </m:r>
+              <m:r>
+                <m:t>P</m:t>
+              </m:r>
+              <m:r>
+                <m:rPr>
+                  <m:sty m:val="p"/>
+                </m:rPr>
+                <m:t>×</m:t>
+              </m:r>
+              <m:r>
+                <m:t>P</m:t>
+              </m:r>
+              <m:r>
+                <m:t>D</m:t>
+              </m:r>
+            </m:oMath>
+          </w:p>
+        </w:tc>
+        <w:tc>
+          <w:tcPr/>
+          <w:p>
+            <w:pPr>
+              <w:pStyle w:val="Compact"/>
+              <w:jc w:val="left"/>
+            </w:pPr>
+            <w:r>
+              <w:t xml:space="preserve">Two chords intersect inside</w:t>
+            </w:r>
+          </w:p>
+        </w:tc>
+      </w:tr>
+      <w:tr>
+        <w:tc>
+          <w:tcPr/>
+          <w:p>
+            <w:pPr>
+              <w:pStyle w:val="Compact"/>
+              <w:jc w:val="left"/>
+            </w:pPr>
+            <w:r>
+              <w:rPr>
+                <w:b/>
+                <w:bCs/>
+              </w:rPr>
+              <w:t xml:space="preserve">Secant-Secant (outside)</w:t>
+            </w:r>
+          </w:p>
+        </w:tc>
+        <w:tc>
+          <w:tcPr/>
+          <w:p>
+            <w:pPr>
+              <w:pStyle w:val="Compact"/>
+              <w:jc w:val="left"/>
+            </w:pPr>
+            <m:oMath>
+              <m:r>
+                <m:t>P</m:t>
+              </m:r>
+              <m:r>
+                <m:t>A</m:t>
+              </m:r>
+              <m:r>
+                <m:rPr>
+                  <m:sty m:val="p"/>
+                </m:rPr>
+                <m:t>×</m:t>
+              </m:r>
+              <m:r>
+                <m:t>P</m:t>
+              </m:r>
+              <m:r>
+                <m:t>B</m:t>
+              </m:r>
+              <m:r>
+                <m:rPr>
+                  <m:sty m:val="p"/>
+                </m:rPr>
+                <m:t>=</m:t>
+              </m:r>
+              <m:r>
+                <m:t>P</m:t>
+              </m:r>
+              <m:r>
+                <m:t>C</m:t>
+              </m:r>
+              <m:r>
+                <m:rPr>
+                  <m:sty m:val="p"/>
+                </m:rPr>
+                <m:t>×</m:t>
+              </m:r>
+              <m:r>
+                <m:t>P</m:t>
+              </m:r>
+              <m:r>
+                <m:t>D</m:t>
+              </m:r>
+            </m:oMath>
+          </w:p>
+        </w:tc>
+        <w:tc>
+          <w:tcPr/>
+          <w:p>
+            <w:pPr>
+              <w:pStyle w:val="Compact"/>
+              <w:jc w:val="left"/>
+            </w:pPr>
+            <w:r>
+              <w:t xml:space="preserve">Two secants from external point</w:t>
+            </w:r>
+          </w:p>
+        </w:tc>
+      </w:tr>
+      <w:tr>
+        <w:tc>
+          <w:tcPr/>
+          <w:p>
+            <w:pPr>
+              <w:pStyle w:val="Compact"/>
+              <w:jc w:val="left"/>
+            </w:pPr>
+            <w:r>
+              <w:rPr>
+                <w:b/>
+                <w:bCs/>
+              </w:rPr>
+              <w:t xml:space="preserve">Secant-Tangent</w:t>
+            </w:r>
+          </w:p>
+        </w:tc>
+        <w:tc>
+          <w:tcPr/>
+          <w:p>
+            <w:pPr>
+              <w:pStyle w:val="Compact"/>
+              <w:jc w:val="left"/>
+            </w:pPr>
+            <m:oMath>
+              <m:r>
+                <m:t>P</m:t>
+              </m:r>
+              <m:r>
+                <m:t>A</m:t>
+              </m:r>
+              <m:r>
+                <m:rPr>
+                  <m:sty m:val="p"/>
+                </m:rPr>
+                <m:t>×</m:t>
+              </m:r>
+              <m:r>
+                <m:t>P</m:t>
+              </m:r>
+              <m:r>
+                <m:t>B</m:t>
+              </m:r>
+              <m:r>
+                <m:rPr>
+                  <m:sty m:val="p"/>
+                </m:rPr>
+                <m:t>=</m:t>
+              </m:r>
+              <m:r>
+                <m:t>P</m:t>
+              </m:r>
+              <m:sSup>
+                <m:e>
+                  <m:r>
+                    <m:t>T</m:t>
+                  </m:r>
+                </m:e>
+                <m:sup>
+                  <m:r>
+                    <m:t>2</m:t>
+                  </m:r>
+                </m:sup>
+              </m:sSup>
+            </m:oMath>
+          </w:p>
+        </w:tc>
+        <w:tc>
+          <w:tcPr/>
+          <w:p>
+            <w:pPr>
+              <w:pStyle w:val="Compact"/>
+              <w:jc w:val="left"/>
+            </w:pPr>
+            <w:r>
+              <w:t xml:space="preserve">Secant and tangent from external point</w:t>
+            </w:r>
+          </w:p>
+        </w:tc>
+      </w:tr>
+      <w:tr>
+        <w:tc>
+          <w:tcPr/>
+          <w:p>
+            <w:pPr>
+              <w:pStyle w:val="Compact"/>
+              <w:jc w:val="left"/>
+            </w:pPr>
+            <w:r>
+              <w:rPr>
+                <w:b/>
+                <w:bCs/>
+              </w:rPr>
+              <w:t xml:space="preserve">Angle inside (2 chords)</w:t>
+            </w:r>
+          </w:p>
+        </w:tc>
+        <w:tc>
+          <w:tcPr/>
+          <w:p>
+            <w:pPr>
+              <w:pStyle w:val="Compact"/>
+              <w:jc w:val="left"/>
+            </w:pPr>
+            <m:oMath>
+              <m:f>
+                <m:fPr>
+                  <m:type m:val="bar"/>
+                </m:fPr>
+                <m:num>
+                  <m:r>
+                    <m:t>1</m:t>
+                  </m:r>
+                </m:num>
+                <m:den>
+                  <m:r>
+                    <m:t>2</m:t>
+                  </m:r>
+                </m:den>
+              </m:f>
+              <m:d>
+                <m:dPr>
+                  <m:begChr m:val="("/>
+                  <m:endChr m:val=")"/>
+                  <m:sepChr m:val=""/>
+                  <m:grow/>
+                </m:dPr>
+                <m:e>
+                  <m:r>
+                    <m:t>a</m:t>
+                  </m:r>
+                  <m:r>
+                    <m:t>r</m:t>
+                  </m:r>
+                  <m:sSub>
+                    <m:e>
+                      <m:r>
+                        <m:t>c</m:t>
+                      </m:r>
+                    </m:e>
+                    <m:sub>
+                      <m:r>
+                        <m:t>1</m:t>
+                      </m:r>
+                    </m:sub>
+                  </m:sSub>
+                  <m:r>
+                    <m:rPr>
+                      <m:sty m:val="p"/>
+                    </m:rPr>
+                    <m:t>+</m:t>
+                  </m:r>
+                  <m:r>
+                    <m:t>a</m:t>
+                  </m:r>
+                  <m:r>
+                    <m:t>r</m:t>
+                  </m:r>
+                  <m:sSub>
+                    <m:e>
+                      <m:r>
+                        <m:t>c</m:t>
+                      </m:r>
+                    </m:e>
+                    <m:sub>
+                      <m:r>
+                        <m:t>2</m:t>
+                      </m:r>
+                    </m:sub>
+                  </m:sSub>
+                </m:e>
+              </m:d>
+            </m:oMath>
+          </w:p>
+        </w:tc>
+        <w:tc>
+          <w:tcPr/>
+          <w:p>
+            <w:pPr>
+              <w:pStyle w:val="Compact"/>
+              <w:jc w:val="left"/>
+            </w:pPr>
+            <w:r>
+              <w:t xml:space="preserve">Angle formed by intersecting chords</w:t>
+            </w:r>
+          </w:p>
+        </w:tc>
+      </w:tr>
+      <w:tr>
+        <w:tc>
+          <w:tcPr/>
+          <w:p>
+            <w:pPr>
+              <w:pStyle w:val="Compact"/>
+              <w:jc w:val="left"/>
+            </w:pPr>
+            <w:r>
+              <w:rPr>
+                <w:b/>
+                <w:bCs/>
+              </w:rPr>
+              <w:t xml:space="preserve">Angle outside (2 sec/tan)</w:t>
+            </w:r>
+          </w:p>
+        </w:tc>
+        <w:tc>
+          <w:tcPr/>
+          <w:p>
+            <w:pPr>
+              <w:pStyle w:val="Compact"/>
+              <w:jc w:val="left"/>
+            </w:pPr>
+            <m:oMath>
+              <m:f>
+                <m:fPr>
+                  <m:type m:val="bar"/>
+                </m:fPr>
+                <m:num>
+                  <m:r>
+                    <m:t>1</m:t>
+                  </m:r>
+                </m:num>
+                <m:den>
+                  <m:r>
+                    <m:t>2</m:t>
+                  </m:r>
+                </m:den>
+              </m:f>
+              <m:d>
+                <m:dPr>
+                  <m:begChr m:val="("/>
+                  <m:endChr m:val=")"/>
+                  <m:sepChr m:val=""/>
+                  <m:grow/>
+                </m:dPr>
+                <m:e>
+                  <m:r>
+                    <m:t>f</m:t>
+                  </m:r>
+                  <m:r>
+                    <m:t>a</m:t>
+                  </m:r>
+                  <m:r>
+                    <m:t>r</m:t>
+                  </m:r>
+                  <m:r>
+                    <m:t> </m:t>
+                  </m:r>
+                  <m:r>
+                    <m:t>a</m:t>
+                  </m:r>
+                  <m:r>
+                    <m:t>r</m:t>
+                  </m:r>
+                  <m:r>
+                    <m:t>c</m:t>
+                  </m:r>
+                  <m:r>
+                    <m:rPr>
+                      <m:sty m:val="p"/>
+                    </m:rPr>
+                    <m:t>−</m:t>
+                  </m:r>
+                  <m:r>
+                    <m:t>n</m:t>
+                  </m:r>
+                  <m:r>
+                    <m:t>e</m:t>
+                  </m:r>
+                  <m:r>
+                    <m:t>a</m:t>
+                  </m:r>
+                  <m:r>
+                    <m:t>r</m:t>
+                  </m:r>
+                  <m:r>
+                    <m:t> </m:t>
+                  </m:r>
+                  <m:r>
+                    <m:t>a</m:t>
+                  </m:r>
+                  <m:r>
+                    <m:t>r</m:t>
+                  </m:r>
+                  <m:r>
+                    <m:t>c</m:t>
+                  </m:r>
+                </m:e>
+              </m:d>
+            </m:oMath>
+          </w:p>
+        </w:tc>
+        <w:tc>
+          <w:tcPr/>
+          <w:p>
+            <w:pPr>
+              <w:pStyle w:val="Compact"/>
+              <w:jc w:val="left"/>
+            </w:pPr>
+            <w:r>
+              <w:t xml:space="preserve">Angle outside circle</w:t>
+            </w:r>
+          </w:p>
+        </w:tc>
+      </w:tr>
+    </w:tbl>
+    <w:bookmarkEnd w:id="58"/>
+    <w:bookmarkStart w:id="59" w:name="practice-problems-from-19_circles.pdf"/>
+    <w:p>
+      <w:pPr>
+        <w:pStyle w:val="Heading3"/>
+      </w:pPr>
+      <w:r>
+        <w:t xml:space="preserve">Practice Problems from 19_Circles.pdf</w:t>
+      </w:r>
+    </w:p>
+    <w:p>
+      <w:pPr>
+        <w:pStyle w:val="Compact"/>
+        <w:numPr>
+          <w:ilvl w:val="0"/>
+          <w:numId w:val="1010"/>
+        </w:numPr>
+      </w:pPr>
+      <w:r>
+        <w:rPr>
+          <w:b/>
+          <w:bCs/>
+        </w:rPr>
+        <w:t xml:space="preserve">Circle:</w:t>
+      </w:r>
+      <w:r>
+        <w:t xml:space="preserve"> </w:t>
+      </w:r>
+      <m:oMath>
+        <m:sSup>
+          <m:e>
+            <m:r>
+              <m:t>x</m:t>
+            </m:r>
+          </m:e>
+          <m:sup>
+            <m:r>
+              <m:t>2</m:t>
+            </m:r>
+          </m:sup>
+        </m:sSup>
+        <m:r>
+          <m:rPr>
+            <m:sty m:val="p"/>
+          </m:rPr>
+          <m:t>+</m:t>
+        </m:r>
+        <m:sSup>
+          <m:e>
+            <m:r>
+              <m:t>y</m:t>
+            </m:r>
+          </m:e>
+          <m:sup>
+            <m:r>
+              <m:t>2</m:t>
+            </m:r>
+          </m:sup>
+        </m:sSup>
+        <m:r>
+          <m:rPr>
+            <m:sty m:val="p"/>
+          </m:rPr>
+          <m:t>−</m:t>
+        </m:r>
+        <m:r>
+          <m:t>6</m:t>
+        </m:r>
+        <m:r>
+          <m:t>x</m:t>
+        </m:r>
+        <m:r>
+          <m:rPr>
+            <m:sty m:val="p"/>
+          </m:rPr>
+          <m:t>+</m:t>
+        </m:r>
+        <m:r>
+          <m:t>8</m:t>
+        </m:r>
+        <m:r>
+          <m:t>y</m:t>
+        </m:r>
+        <m:r>
+          <m:rPr>
+            <m:sty m:val="p"/>
+          </m:rPr>
+          <m:t>=</m:t>
+        </m:r>
+        <m:r>
+          <m:t>0</m:t>
+        </m:r>
+      </m:oMath>
+      <w:r>
+        <w:t xml:space="preserve">. Find center and radius.</w:t>
+      </w:r>
+    </w:p>
+    <w:p>
+      <w:pPr>
+        <w:pStyle w:val="Compact"/>
+        <w:numPr>
+          <w:ilvl w:val="1"/>
+          <w:numId w:val="1011"/>
+        </w:numPr>
+      </w:pPr>
+      <m:oMath>
+        <m:sSup>
+          <m:e>
+            <m:d>
+              <m:dPr>
+                <m:begChr m:val="("/>
+                <m:endChr m:val=")"/>
+                <m:sepChr m:val=""/>
+                <m:grow/>
+              </m:dPr>
+              <m:e>
+                <m:r>
+                  <m:t>x</m:t>
+                </m:r>
+                <m:r>
+                  <m:rPr>
+                    <m:sty m:val="p"/>
+                  </m:rPr>
+                  <m:t>−</m:t>
+                </m:r>
+                <m:r>
+                  <m:t>3</m:t>
+                </m:r>
+              </m:e>
+            </m:d>
+          </m:e>
+          <m:sup>
+            <m:r>
+              <m:t>2</m:t>
+            </m:r>
+          </m:sup>
+        </m:sSup>
+        <m:r>
+          <m:rPr>
+            <m:sty m:val="p"/>
+          </m:rPr>
+          <m:t>+</m:t>
+        </m:r>
+        <m:sSup>
+          <m:e>
+            <m:d>
+              <m:dPr>
+                <m:begChr m:val="("/>
+                <m:endChr m:val=")"/>
+                <m:sepChr m:val=""/>
+                <m:grow/>
+              </m:dPr>
+              <m:e>
+                <m:r>
+                  <m:t>y</m:t>
+                </m:r>
+                <m:r>
+                  <m:rPr>
+                    <m:sty m:val="p"/>
+                  </m:rPr>
+                  <m:t>+</m:t>
+                </m:r>
+                <m:r>
+                  <m:t>4</m:t>
+                </m:r>
+              </m:e>
+            </m:d>
+          </m:e>
+          <m:sup>
+            <m:r>
+              <m:t>2</m:t>
+            </m:r>
+          </m:sup>
+        </m:sSup>
+        <m:r>
+          <m:rPr>
+            <m:sty m:val="p"/>
+          </m:rPr>
+          <m:t>=</m:t>
+        </m:r>
+        <m:r>
+          <m:t>25</m:t>
+        </m:r>
+      </m:oMath>
+      <w:r>
+        <w:t xml:space="preserve"> </w:t>
+      </w:r>
+      <w:r>
+        <w:t xml:space="preserve">→ Center</w:t>
+      </w:r>
+      <w:r>
+        <w:t xml:space="preserve"> </w:t>
+      </w:r>
+      <m:oMath>
+        <m:d>
+          <m:dPr>
+            <m:begChr m:val="("/>
+            <m:endChr m:val=")"/>
+            <m:sepChr m:val=""/>
+            <m:grow/>
+          </m:dPr>
+          <m:e>
+            <m:r>
+              <m:t>3</m:t>
+            </m:r>
+            <m:r>
+              <m:rPr>
+                <m:sty m:val="p"/>
+              </m:rPr>
+              <m:t>,</m:t>
+            </m:r>
+            <m:r>
+              <m:rPr>
+                <m:sty m:val="p"/>
+              </m:rPr>
+              <m:t>−</m:t>
+            </m:r>
+            <m:r>
+              <m:t>4</m:t>
+            </m:r>
+          </m:e>
+        </m:d>
+      </m:oMath>
+      <w:r>
+        <w:t xml:space="preserve">,</w:t>
+      </w:r>
+      <w:r>
+        <w:t xml:space="preserve"> </w:t>
+      </w:r>
+      <m:oMath>
+        <m:r>
+          <m:t>r</m:t>
+        </m:r>
+        <m:r>
+          <m:rPr>
+            <m:sty m:val="p"/>
+          </m:rPr>
+          <m:t>=</m:t>
+        </m:r>
+        <m:r>
+          <m:t>5</m:t>
+        </m:r>
+      </m:oMath>
+    </w:p>
+    <w:p>
+      <w:pPr>
+        <w:pStyle w:val="Compact"/>
+        <w:numPr>
+          <w:ilvl w:val="0"/>
+          <w:numId w:val="1010"/>
+        </w:numPr>
+      </w:pPr>
+      <w:r>
+        <w:rPr>
+          <w:b/>
+          <w:bCs/>
+        </w:rPr>
+        <w:t xml:space="preserve">Central angle</w:t>
+      </w:r>
+      <w:r>
+        <w:t xml:space="preserve"> </w:t>
+      </w:r>
+      <m:oMath>
+        <m:r>
+          <m:t>A</m:t>
+        </m:r>
+        <m:r>
+          <m:t>O</m:t>
+        </m:r>
+        <m:r>
+          <m:t>B</m:t>
+        </m:r>
+        <m:r>
+          <m:rPr>
+            <m:sty m:val="p"/>
+          </m:rPr>
+          <m:t>=</m:t>
+        </m:r>
+        <m:r>
+          <m:t>80</m:t>
+        </m:r>
+        <m:r>
+          <m:rPr>
+            <m:sty m:val="p"/>
+          </m:rPr>
+          <m:t>°</m:t>
+        </m:r>
+      </m:oMath>
+      <w:r>
+        <w:t xml:space="preserve">. Inscribed angle</w:t>
+      </w:r>
+      <w:r>
+        <w:t xml:space="preserve"> </w:t>
+      </w:r>
+      <m:oMath>
+        <m:r>
+          <m:t>A</m:t>
+        </m:r>
+        <m:r>
+          <m:t>C</m:t>
+        </m:r>
+        <m:r>
+          <m:t>B</m:t>
+        </m:r>
+      </m:oMath>
+      <w:r>
+        <w:t xml:space="preserve">?</w:t>
+      </w:r>
+    </w:p>
+    <w:p>
+      <w:pPr>
+        <w:pStyle w:val="Compact"/>
+        <w:numPr>
+          <w:ilvl w:val="1"/>
+          <w:numId w:val="1012"/>
+        </w:numPr>
+      </w:pPr>
+      <m:oMath>
+        <m:r>
+          <m:t>40</m:t>
+        </m:r>
+        <m:r>
+          <m:rPr>
+            <m:sty m:val="p"/>
+          </m:rPr>
+          <m:t>°</m:t>
+        </m:r>
+      </m:oMath>
+      <w:r>
+        <w:t xml:space="preserve"> </w:t>
+      </w:r>
+      <w:r>
+        <w:t xml:space="preserve">(half of central)</w:t>
+      </w:r>
+    </w:p>
+    <w:p>
+      <w:pPr>
+        <w:pStyle w:val="Compact"/>
+        <w:numPr>
+          <w:ilvl w:val="0"/>
+          <w:numId w:val="1010"/>
+        </w:numPr>
+      </w:pPr>
+      <w:r>
+        <w:rPr>
+          <w:b/>
+          <w:bCs/>
+        </w:rPr>
+        <w:t xml:space="preserve">Two chords intersect:</w:t>
+      </w:r>
+      <w:r>
+        <w:t xml:space="preserve"> </w:t>
+      </w:r>
+      <w:r>
+        <w:t xml:space="preserve">Segments 3, 4 and 2, x. Find x.</w:t>
+      </w:r>
+    </w:p>
+    <w:p>
+      <w:pPr>
+        <w:pStyle w:val="Compact"/>
+        <w:numPr>
+          <w:ilvl w:val="1"/>
+          <w:numId w:val="1013"/>
+        </w:numPr>
+      </w:pPr>
+      <m:oMath>
+        <m:r>
+          <m:t>3</m:t>
+        </m:r>
+        <m:r>
+          <m:rPr>
+            <m:sty m:val="p"/>
+          </m:rPr>
+          <m:t>×</m:t>
+        </m:r>
+        <m:r>
+          <m:t>4</m:t>
+        </m:r>
+        <m:r>
+          <m:rPr>
+            <m:sty m:val="p"/>
+          </m:rPr>
+          <m:t>=</m:t>
+        </m:r>
+        <m:r>
+          <m:t>2</m:t>
+        </m:r>
+        <m:r>
+          <m:rPr>
+            <m:sty m:val="p"/>
+          </m:rPr>
+          <m:t>×</m:t>
+        </m:r>
+        <m:r>
+          <m:t>x</m:t>
+        </m:r>
+      </m:oMath>
+      <w:r>
+        <w:t xml:space="preserve"> </w:t>
+      </w:r>
+      <w:r>
+        <w:t xml:space="preserve">→</w:t>
+      </w:r>
+      <w:r>
+        <w:t xml:space="preserve"> </w:t>
+      </w:r>
+      <m:oMath>
+        <m:r>
+          <m:t>x</m:t>
+        </m:r>
+        <m:r>
+          <m:rPr>
+            <m:sty m:val="p"/>
+          </m:rPr>
+          <m:t>=</m:t>
+        </m:r>
+        <m:r>
+          <m:t>6</m:t>
+        </m:r>
+      </m:oMath>
+    </w:p>
+    <w:p>
+      <w:pPr>
+        <w:pStyle w:val="Compact"/>
+        <w:numPr>
+          <w:ilvl w:val="0"/>
+          <w:numId w:val="1010"/>
+        </w:numPr>
+      </w:pPr>
+      <w:r>
+        <w:rPr>
+          <w:b/>
+          <w:bCs/>
+        </w:rPr>
+        <w:t xml:space="preserve">Tangent from point P:</w:t>
+      </w:r>
+      <w:r>
+        <w:t xml:space="preserve"> </w:t>
+      </w:r>
+      <w:r>
+        <w:t xml:space="preserve">Tangent = 6, Secant external = 4. Find whole secant.</w:t>
+      </w:r>
+    </w:p>
+    <w:p>
+      <w:pPr>
+        <w:pStyle w:val="Compact"/>
+        <w:numPr>
+          <w:ilvl w:val="1"/>
+          <w:numId w:val="1014"/>
+        </w:numPr>
+      </w:pPr>
+      <m:oMath>
+        <m:sSup>
+          <m:e>
+            <m:r>
+              <m:t>6</m:t>
+            </m:r>
+          </m:e>
+          <m:sup>
+            <m:r>
+              <m:t>2</m:t>
+            </m:r>
+          </m:sup>
+        </m:sSup>
+        <m:r>
+          <m:rPr>
+            <m:sty m:val="p"/>
+          </m:rPr>
+          <m:t>=</m:t>
+        </m:r>
+        <m:r>
+          <m:t>4</m:t>
+        </m:r>
+        <m:r>
+          <m:rPr>
+            <m:sty m:val="p"/>
+          </m:rPr>
+          <m:t>×</m:t>
+        </m:r>
+        <m:r>
+          <m:t>w</m:t>
+        </m:r>
+        <m:r>
+          <m:t>h</m:t>
+        </m:r>
+        <m:r>
+          <m:t>o</m:t>
+        </m:r>
+        <m:r>
+          <m:t>l</m:t>
+        </m:r>
+        <m:r>
+          <m:t>e</m:t>
+        </m:r>
+      </m:oMath>
+      <w:r>
+        <w:t xml:space="preserve"> </w:t>
+      </w:r>
+      <w:r>
+        <w:t xml:space="preserve">→</w:t>
+      </w:r>
+      <w:r>
+        <w:t xml:space="preserve"> </w:t>
+      </w:r>
+      <m:oMath>
+        <m:r>
+          <m:t>w</m:t>
+        </m:r>
+        <m:r>
+          <m:t>h</m:t>
+        </m:r>
+        <m:r>
+          <m:t>o</m:t>
+        </m:r>
+        <m:r>
+          <m:t>l</m:t>
+        </m:r>
+        <m:r>
+          <m:t>e</m:t>
+        </m:r>
+        <m:r>
+          <m:rPr>
+            <m:sty m:val="p"/>
+          </m:rPr>
+          <m:t>=</m:t>
+        </m:r>
+        <m:r>
+          <m:t>9</m:t>
+        </m:r>
+      </m:oMath>
+    </w:p>
+    <w:p>
+      <w:pPr>
+        <w:pStyle w:val="Compact"/>
+        <w:numPr>
+          <w:ilvl w:val="0"/>
+          <w:numId w:val="1010"/>
+        </w:numPr>
+      </w:pPr>
+      <w:r>
+        <w:rPr>
+          <w:b/>
+          <w:bCs/>
+        </w:rPr>
+        <w:t xml:space="preserve">Arc length:</w:t>
+      </w:r>
+      <w:r>
+        <w:t xml:space="preserve"> </w:t>
+      </w:r>
+      <w:r>
+        <w:t xml:space="preserve">Radius 10, central angle 120°.</w:t>
+      </w:r>
+    </w:p>
+    <w:p>
+      <w:pPr>
+        <w:pStyle w:val="Compact"/>
+        <w:numPr>
+          <w:ilvl w:val="1"/>
+          <w:numId w:val="1015"/>
+        </w:numPr>
+      </w:pPr>
+      <m:oMath>
+        <m:d>
+          <m:dPr>
+            <m:begChr m:val="("/>
+            <m:endChr m:val=")"/>
+            <m:sepChr m:val=""/>
+            <m:grow/>
+          </m:dPr>
+          <m:e>
+            <m:r>
+              <m:t>120</m:t>
+            </m:r>
+            <m:r>
+              <m:rPr>
+                <m:sty m:val="p"/>
+              </m:rPr>
+              <m:t>/</m:t>
+            </m:r>
+            <m:r>
+              <m:t>360</m:t>
+            </m:r>
+          </m:e>
+        </m:d>
+        <m:r>
+          <m:rPr>
+            <m:sty m:val="p"/>
+          </m:rPr>
+          <m:t>×</m:t>
+        </m:r>
+        <m:r>
+          <m:t>2</m:t>
+        </m:r>
+        <m:r>
+          <m:t>π</m:t>
+        </m:r>
+        <m:r>
+          <m:rPr>
+            <m:sty m:val="p"/>
+          </m:rPr>
+          <m:t>×</m:t>
+        </m:r>
+        <m:r>
+          <m:t>10</m:t>
+        </m:r>
+        <m:r>
+          <m:rPr>
+            <m:sty m:val="p"/>
+          </m:rPr>
+          <m:t>=</m:t>
+        </m:r>
+        <m:f>
+          <m:fPr>
+            <m:type m:val="bar"/>
+          </m:fPr>
+          <m:num>
+            <m:r>
+              <m:t>20</m:t>
+            </m:r>
+            <m:r>
+              <m:t>π</m:t>
+            </m:r>
+          </m:num>
+          <m:den>
+            <m:r>
+              <m:t>3</m:t>
+            </m:r>
+          </m:den>
+        </m:f>
+      </m:oMath>
+    </w:p>
+    <w:p>
+      <w:pPr>
+        <w:pStyle w:val="FirstParagraph"/>
+      </w:pPr>
+      <w:r>
+        <w:rPr>
+          <w:i/>
+          <w:iCs/>
+        </w:rPr>
+        <w:t xml:space="preserve">Next update: Continue monitoring 2026 Summer SAT/ACT @ AHA for additional classroom materials</w:t>
+      </w:r>
+    </w:p>
+    <w:bookmarkEnd w:id="59"/>
+    <w:bookmarkEnd w:id="60"/>
+    <w:bookmarkEnd w:id="61"/>
     <w:sectPr/>
   </w:body>
 </w:document>
@@ -4435,6 +6591,51 @@
     <w:abstractNumId w:val="991"/>
   </w:num>
   <w:num w:numId="1009">
+    <w:abstractNumId w:val="991"/>
+  </w:num>
+  <w:num w:numId="1010">
+    <w:abstractNumId w:val="99411"/>
+    <w:lvlOverride w:ilvl="0">
+      <w:startOverride w:val="1"/>
+    </w:lvlOverride>
+    <w:lvlOverride w:ilvl="1">
+      <w:startOverride w:val="1"/>
+    </w:lvlOverride>
+    <w:lvlOverride w:ilvl="2">
+      <w:startOverride w:val="1"/>
+    </w:lvlOverride>
+    <w:lvlOverride w:ilvl="3">
+      <w:startOverride w:val="1"/>
+    </w:lvlOverride>
+    <w:lvlOverride w:ilvl="4">
+      <w:startOverride w:val="1"/>
+    </w:lvlOverride>
+    <w:lvlOverride w:ilvl="5">
+      <w:startOverride w:val="1"/>
+    </w:lvlOverride>
+    <w:lvlOverride w:ilvl="6">
+      <w:startOverride w:val="1"/>
+    </w:lvlOverride>
+    <w:lvlOverride w:ilvl="7">
+      <w:startOverride w:val="1"/>
+    </w:lvlOverride>
+    <w:lvlOverride w:ilvl="8">
+      <w:startOverride w:val="1"/>
+    </w:lvlOverride>
+  </w:num>
+  <w:num w:numId="1011">
+    <w:abstractNumId w:val="991"/>
+  </w:num>
+  <w:num w:numId="1012">
+    <w:abstractNumId w:val="991"/>
+  </w:num>
+  <w:num w:numId="1013">
+    <w:abstractNumId w:val="991"/>
+  </w:num>
+  <w:num w:numId="1014">
+    <w:abstractNumId w:val="991"/>
+  </w:num>
+  <w:num w:numId="1015">
     <w:abstractNumId w:val="991"/>
   </w:num>
 </w:numbering>

</xml_diff>